<commit_message>
Fix Chinese font rendering in all report charts
Co-authored-by: zhujorya-eng <zhujorya-eng@users.noreply.github.com>
</commit_message>
<xml_diff>
--- a/output/课题结题研究报告.docx
+++ b/output/课题结题研究报告.docx
@@ -598,7 +598,7 @@
       <w:r>
         <w:drawing>
           <wp:inline xmlns:a="http://schemas.openxmlformats.org/drawingml/2006/main" xmlns:pic="http://schemas.openxmlformats.org/drawingml/2006/picture">
-            <wp:extent cx="5029200" cy="2469186"/>
+            <wp:extent cx="5029200" cy="2730619"/>
             <wp:docPr id="1" name="Picture 1"/>
             <wp:cNvGraphicFramePr>
               <a:graphicFrameLocks noChangeAspect="1"/>
@@ -619,7 +619,7 @@
                   <pic:spPr>
                     <a:xfrm>
                       <a:off x="0" y="0"/>
-                      <a:ext cx="5029200" cy="2469186"/>
+                      <a:ext cx="5029200" cy="2730619"/>
                     </a:xfrm>
                     <a:prstGeom prst="rect"/>
                   </pic:spPr>
@@ -1413,7 +1413,7 @@
       <w:r>
         <w:drawing>
           <wp:inline xmlns:a="http://schemas.openxmlformats.org/drawingml/2006/main" xmlns:pic="http://schemas.openxmlformats.org/drawingml/2006/picture">
-            <wp:extent cx="5029200" cy="1616704"/>
+            <wp:extent cx="5029200" cy="1619947"/>
             <wp:docPr id="2" name="Picture 2"/>
             <wp:cNvGraphicFramePr>
               <a:graphicFrameLocks noChangeAspect="1"/>
@@ -1434,7 +1434,7 @@
                   <pic:spPr>
                     <a:xfrm>
                       <a:off x="0" y="0"/>
-                      <a:ext cx="5029200" cy="1616704"/>
+                      <a:ext cx="5029200" cy="1619947"/>
                     </a:xfrm>
                     <a:prstGeom prst="rect"/>
                   </pic:spPr>
@@ -1542,7 +1542,7 @@
       <w:r>
         <w:drawing>
           <wp:inline xmlns:a="http://schemas.openxmlformats.org/drawingml/2006/main" xmlns:pic="http://schemas.openxmlformats.org/drawingml/2006/picture">
-            <wp:extent cx="5029200" cy="4303788"/>
+            <wp:extent cx="5029200" cy="4421124"/>
             <wp:docPr id="3" name="Picture 3"/>
             <wp:cNvGraphicFramePr>
               <a:graphicFrameLocks noChangeAspect="1"/>
@@ -1563,7 +1563,7 @@
                   <pic:spPr>
                     <a:xfrm>
                       <a:off x="0" y="0"/>
-                      <a:ext cx="5029200" cy="4303788"/>
+                      <a:ext cx="5029200" cy="4421124"/>
                     </a:xfrm>
                     <a:prstGeom prst="rect"/>
                   </pic:spPr>

</xml_diff>